<commit_message>
Plan manuscript writing requirements
</commit_message>
<xml_diff>
--- a/submission/bmc_medical_genomics_2026-05-01/MANUSCRIPT_BMC_MEDICAL_GENOMICS_SUBMISSION_DRAFT.docx
+++ b/submission/bmc_medical_genomics_2026-05-01/MANUSCRIPT_BMC_MEDICAL_GENOMICS_SUBMISSION_DRAFT.docx
@@ -82,7 +82,7 @@
         <w:spacing w:line="480" w:lineRule="auto" w:after="120"/>
       </w:pPr>
       <w:r>
-        <w:t xml:space="preserve">Guangdong University of Petrochemical Technology (GDUPT), Maoming, Guangdong, China</w:t>
+        <w:t xml:space="preserve">Guangdong University of Petrochemical Technology (GDUPT), 139 Guandu 2nd Road, Maoming 525000, Guangdong, China</w:t>
       </w:r>
     </w:p>
     <w:bookmarkEnd w:id="12"/>
@@ -120,7 +120,7 @@
         <w:spacing w:line="480" w:lineRule="auto" w:after="120"/>
       </w:pPr>
       <w:r>
-        <w:t xml:space="preserve">Address: Guangdong University of Petrochemical Technology (GDUPT), Maoming, Guangdong, China. [Detailed address to be confirmed]</w:t>
+        <w:t xml:space="preserve">Address: Guangdong University of Petrochemical Technology (GDUPT), 139 Guandu 2nd Road, Maoming 525000, Guangdong, China</w:t>
       </w:r>
     </w:p>
     <w:bookmarkEnd w:id="13"/>

</xml_diff>